<commit_message>
Few changes with spaces
</commit_message>
<xml_diff>
--- a/report/report.docx
+++ b/report/report.docx
@@ -558,8 +558,8 @@
       <w:tblGrid>
         <w:gridCol w:w="2297"/>
         <w:gridCol w:w="1783"/>
-        <w:gridCol w:w="2465"/>
-        <w:gridCol w:w="260"/>
+        <w:gridCol w:w="2464"/>
+        <w:gridCol w:w="261"/>
         <w:gridCol w:w="2549"/>
       </w:tblGrid>
       <w:tr>
@@ -620,7 +620,7 @@
         </w:tc>
         <w:tc>
           <w:tcPr>
-            <w:tcW w:w="2465" w:type="dxa"/>
+            <w:tcW w:w="2464" w:type="dxa"/>
             <w:tcBorders>
               <w:bottom w:val="single" w:sz="4" w:space="0" w:color="000000"/>
             </w:tcBorders>
@@ -646,7 +646,7 @@
         </w:tc>
         <w:tc>
           <w:tcPr>
-            <w:tcW w:w="260" w:type="dxa"/>
+            <w:tcW w:w="261" w:type="dxa"/>
             <w:tcBorders/>
           </w:tcPr>
           <w:p>
@@ -749,7 +749,7 @@
         </w:tc>
         <w:tc>
           <w:tcPr>
-            <w:tcW w:w="2465" w:type="dxa"/>
+            <w:tcW w:w="2464" w:type="dxa"/>
             <w:tcBorders>
               <w:bottom w:val="single" w:sz="4" w:space="0" w:color="000000"/>
             </w:tcBorders>
@@ -775,7 +775,7 @@
         </w:tc>
         <w:tc>
           <w:tcPr>
-            <w:tcW w:w="260" w:type="dxa"/>
+            <w:tcW w:w="261" w:type="dxa"/>
             <w:tcBorders/>
           </w:tcPr>
           <w:p>
@@ -878,7 +878,7 @@
         </w:tc>
         <w:tc>
           <w:tcPr>
-            <w:tcW w:w="2465" w:type="dxa"/>
+            <w:tcW w:w="2464" w:type="dxa"/>
             <w:tcBorders>
               <w:bottom w:val="single" w:sz="4" w:space="0" w:color="000000"/>
             </w:tcBorders>
@@ -904,7 +904,7 @@
         </w:tc>
         <w:tc>
           <w:tcPr>
-            <w:tcW w:w="260" w:type="dxa"/>
+            <w:tcW w:w="261" w:type="dxa"/>
             <w:tcBorders/>
           </w:tcPr>
           <w:p>
@@ -1005,7 +1005,7 @@
         </w:tc>
         <w:tc>
           <w:tcPr>
-            <w:tcW w:w="2465" w:type="dxa"/>
+            <w:tcW w:w="2464" w:type="dxa"/>
             <w:tcBorders>
               <w:top w:val="single" w:sz="4" w:space="0" w:color="000000"/>
             </w:tcBorders>
@@ -1030,7 +1030,7 @@
         </w:tc>
         <w:tc>
           <w:tcPr>
-            <w:tcW w:w="260" w:type="dxa"/>
+            <w:tcW w:w="261" w:type="dxa"/>
             <w:tcBorders/>
           </w:tcPr>
           <w:p>
@@ -1126,7 +1126,7 @@
         </w:tc>
         <w:tc>
           <w:tcPr>
-            <w:tcW w:w="2465" w:type="dxa"/>
+            <w:tcW w:w="2464" w:type="dxa"/>
             <w:tcBorders>
               <w:bottom w:val="single" w:sz="4" w:space="0" w:color="000000"/>
             </w:tcBorders>
@@ -1152,7 +1152,7 @@
         </w:tc>
         <w:tc>
           <w:tcPr>
-            <w:tcW w:w="260" w:type="dxa"/>
+            <w:tcW w:w="261" w:type="dxa"/>
             <w:tcBorders/>
           </w:tcPr>
           <w:p>
@@ -1252,7 +1252,7 @@
         </w:tc>
         <w:tc>
           <w:tcPr>
-            <w:tcW w:w="2465" w:type="dxa"/>
+            <w:tcW w:w="2464" w:type="dxa"/>
             <w:tcBorders>
               <w:top w:val="single" w:sz="4" w:space="0" w:color="000000"/>
             </w:tcBorders>
@@ -1277,7 +1277,7 @@
         </w:tc>
         <w:tc>
           <w:tcPr>
-            <w:tcW w:w="260" w:type="dxa"/>
+            <w:tcW w:w="261" w:type="dxa"/>
             <w:tcBorders/>
           </w:tcPr>
           <w:p>
@@ -1453,8 +1453,8 @@
         <w:tblLook w:val="04a0" w:noHBand="0" w:noVBand="1" w:firstColumn="1" w:lastRow="0" w:lastColumn="0" w:firstRow="1"/>
       </w:tblPr>
       <w:tblGrid>
-        <w:gridCol w:w="4041"/>
-        <w:gridCol w:w="2315"/>
+        <w:gridCol w:w="4040"/>
+        <w:gridCol w:w="2316"/>
         <w:gridCol w:w="2998"/>
       </w:tblGrid>
       <w:tr>
@@ -1762,7 +1762,7 @@
         </w:trPr>
         <w:tc>
           <w:tcPr>
-            <w:tcW w:w="4041" w:type="dxa"/>
+            <w:tcW w:w="4040" w:type="dxa"/>
             <w:tcBorders/>
             <w:vAlign w:val="bottom"/>
           </w:tcPr>
@@ -1784,7 +1784,7 @@
         </w:tc>
         <w:tc>
           <w:tcPr>
-            <w:tcW w:w="2315" w:type="dxa"/>
+            <w:tcW w:w="2316" w:type="dxa"/>
             <w:tcBorders>
               <w:bottom w:val="single" w:sz="4" w:space="0" w:color="000000"/>
             </w:tcBorders>
@@ -1835,7 +1835,7 @@
         </w:trPr>
         <w:tc>
           <w:tcPr>
-            <w:tcW w:w="4041" w:type="dxa"/>
+            <w:tcW w:w="4040" w:type="dxa"/>
             <w:tcBorders/>
             <w:vAlign w:val="bottom"/>
           </w:tcPr>
@@ -1857,7 +1857,7 @@
         </w:tc>
         <w:tc>
           <w:tcPr>
-            <w:tcW w:w="2315" w:type="dxa"/>
+            <w:tcW w:w="2316" w:type="dxa"/>
             <w:tcBorders>
               <w:bottom w:val="single" w:sz="4" w:space="0" w:color="000000"/>
             </w:tcBorders>
@@ -1912,7 +1912,7 @@
         </w:trPr>
         <w:tc>
           <w:tcPr>
-            <w:tcW w:w="4041" w:type="dxa"/>
+            <w:tcW w:w="4040" w:type="dxa"/>
             <w:tcBorders/>
             <w:vAlign w:val="bottom"/>
           </w:tcPr>
@@ -1934,7 +1934,7 @@
         </w:tc>
         <w:tc>
           <w:tcPr>
-            <w:tcW w:w="2315" w:type="dxa"/>
+            <w:tcW w:w="2316" w:type="dxa"/>
             <w:tcBorders>
               <w:bottom w:val="single" w:sz="4" w:space="0" w:color="000000"/>
             </w:tcBorders>
@@ -1989,7 +1989,7 @@
         </w:trPr>
         <w:tc>
           <w:tcPr>
-            <w:tcW w:w="4041" w:type="dxa"/>
+            <w:tcW w:w="4040" w:type="dxa"/>
             <w:tcBorders/>
             <w:vAlign w:val="bottom"/>
           </w:tcPr>
@@ -2010,7 +2010,7 @@
         </w:tc>
         <w:tc>
           <w:tcPr>
-            <w:tcW w:w="2315" w:type="dxa"/>
+            <w:tcW w:w="2316" w:type="dxa"/>
             <w:tcBorders>
               <w:top w:val="single" w:sz="4" w:space="0" w:color="000000"/>
               <w:bottom w:val="single" w:sz="4" w:space="0" w:color="000000"/>
@@ -3373,14 +3373,15 @@
       <w:pPr>
         <w:pStyle w:val="BodyText"/>
         <w:numPr>
-          <w:ilvl w:val="0"/>
-          <w:numId w:val="0"/>
+          <w:ilvl w:val="2"/>
+          <w:numId w:val="2"/>
         </w:numPr>
-        <w:ind w:hanging="0" w:left="0"/>
-        <w:rPr/>
-      </w:pPr>
-      <w:r>
-        <w:rPr/>
+        <w:ind w:firstLine="709"/>
+        <w:rPr/>
+      </w:pPr>
+      <w:r>
+        <w:rPr/>
+        <w:t>Так как в задаче нужно минимизировать затраты, лучшим считается решение с меньшим значением cost.</w:t>
       </w:r>
     </w:p>
     <w:p>
@@ -3395,7 +3396,7 @@
       </w:pPr>
       <w:r>
         <w:rPr/>
-        <w:t>Так как в задаче нужно минимизировать затраты, лучшим считается решение с меньшим значением cost.</w:t>
+        <w:t>Для работы методов отбора дополнительно используется значение приспособленности fitness. Оно считается по формуле: fitness = 1 / (1 + cost).</w:t>
       </w:r>
     </w:p>
     <w:p>
@@ -3410,6 +3411,7 @@
       </w:pPr>
       <w:r>
         <w:rPr/>
+        <w:t>Начальная популяция создаётся случайным образом. Для каждой особи сначала создаётся массив работ от 0 до N - 1, после чего этот массив случайно перемешивается. Поэтому каждая особь сразу является корректным решением задачи, т.е. не могут встретиться работы с одинаковыми номерами.</w:t>
       </w:r>
     </w:p>
     <w:p>
@@ -3424,7 +3426,7 @@
       </w:pPr>
       <w:r>
         <w:rPr/>
-        <w:t>Для работы методов отбора дополнительно используется значение приспособленности fitness. Оно считается по формуле: fitness = 1 / (1 + cost).</w:t>
+        <w:t>В программе реализованы два метода отбора родителей: турнирный отбор и стохастическая универсальная рулетка.</w:t>
       </w:r>
     </w:p>
     <w:p>
@@ -3439,93 +3441,7 @@
       </w:pPr>
       <w:r>
         <w:rPr/>
-      </w:r>
-    </w:p>
-    <w:p>
-      <w:pPr>
-        <w:pStyle w:val="BodyText"/>
-        <w:numPr>
-          <w:ilvl w:val="2"/>
-          <w:numId w:val="2"/>
-        </w:numPr>
-        <w:ind w:firstLine="709"/>
-        <w:rPr/>
-      </w:pPr>
-      <w:r>
-        <w:rPr/>
-        <w:t>Начальная популяция создаётся случайным образом. Для каждой особи сначала создаётся массив работ от 0 до N - 1, после чего этот массив случайно перемешивается. Поэтому каждая особь сразу является корректным решением задачи, т.е. не могут встретиться работы с одинаковыми номерами.</w:t>
-      </w:r>
-    </w:p>
-    <w:p>
-      <w:pPr>
-        <w:pStyle w:val="BodyText"/>
-        <w:numPr>
-          <w:ilvl w:val="2"/>
-          <w:numId w:val="2"/>
-        </w:numPr>
-        <w:ind w:firstLine="709"/>
-        <w:rPr/>
-      </w:pPr>
-      <w:r>
-        <w:rPr/>
-      </w:r>
-    </w:p>
-    <w:p>
-      <w:pPr>
-        <w:pStyle w:val="BodyText"/>
-        <w:numPr>
-          <w:ilvl w:val="2"/>
-          <w:numId w:val="2"/>
-        </w:numPr>
-        <w:ind w:firstLine="709"/>
-        <w:rPr/>
-      </w:pPr>
-      <w:r>
-        <w:rPr/>
-        <w:t>В программе реализованы два метода отбора родителей: турнирный отбор и стохастическая универсальная рулетка.</w:t>
-      </w:r>
-    </w:p>
-    <w:p>
-      <w:pPr>
-        <w:pStyle w:val="BodyText"/>
-        <w:numPr>
-          <w:ilvl w:val="2"/>
-          <w:numId w:val="2"/>
-        </w:numPr>
-        <w:ind w:firstLine="709"/>
-        <w:rPr/>
-      </w:pPr>
-      <w:r>
-        <w:rPr/>
-      </w:r>
-    </w:p>
-    <w:p>
-      <w:pPr>
-        <w:pStyle w:val="BodyText"/>
-        <w:numPr>
-          <w:ilvl w:val="2"/>
-          <w:numId w:val="2"/>
-        </w:numPr>
-        <w:ind w:firstLine="709"/>
-        <w:rPr/>
-      </w:pPr>
-      <w:r>
-        <w:rPr/>
         <w:t>При турнирном отборе случайно выбирается несколько особей из популяции. Количество таких особей задаётся параметром tournamentSize. Из выбранных особей родителем становится та, у которой стоимость решения меньше.</w:t>
-      </w:r>
-    </w:p>
-    <w:p>
-      <w:pPr>
-        <w:pStyle w:val="BodyText"/>
-        <w:numPr>
-          <w:ilvl w:val="2"/>
-          <w:numId w:val="2"/>
-        </w:numPr>
-        <w:ind w:firstLine="709"/>
-        <w:rPr/>
-      </w:pPr>
-      <w:r>
-        <w:rPr/>
       </w:r>
     </w:p>
     <w:p>
@@ -5510,7 +5426,7 @@
       <w:rPr>
         <w:rStyle w:val="PageNumber"/>
       </w:rPr>
-      <w:t>13</w:t>
+      <w:t>25</w:t>
     </w:r>
     <w:r>
       <w:rPr>

</xml_diff>

<commit_message>
Distribution of tasks added
</commit_message>
<xml_diff>
--- a/report/report.docx
+++ b/report/report.docx
@@ -2762,7 +2762,7 @@
       </w:pPr>
       <w:r>
         <w:rPr/>
-        <w:t>Изучение генетических алгоритмов как подхода к решению задач;</w:t>
+        <w:t>Изучение генетических алгоритмов как подхода к решению задач (Все члены бригады);</w:t>
       </w:r>
     </w:p>
     <w:p>
@@ -2776,7 +2776,7 @@
       </w:pPr>
       <w:r>
         <w:rPr/>
-        <w:t>Создание модели решения задачи на языке генетических алгоритмов;</w:t>
+        <w:t>Создание модели решения задачи на языке генетических алгоритмов (В.А. Будкин);</w:t>
       </w:r>
     </w:p>
     <w:p>
@@ -2790,7 +2790,7 @@
       </w:pPr>
       <w:r>
         <w:rPr/>
-        <w:t>Создание шаблона гарфического интерфейса;</w:t>
+        <w:t>Создание шаблона гарфического интерфейса (Д.А. Мигрин);</w:t>
       </w:r>
     </w:p>
     <w:p>
@@ -2804,7 +2804,7 @@
       </w:pPr>
       <w:r>
         <w:rPr/>
-        <w:t>Изучение библиотеки raylib для создания интерфейса;</w:t>
+        <w:t>Изучение библиотеки raylib для создания интерфейса (Д.А. Мигрин, А.И. Бегеза);</w:t>
       </w:r>
     </w:p>
     <w:p>
@@ -2818,7 +2818,7 @@
       </w:pPr>
       <w:r>
         <w:rPr/>
-        <w:t>Реализация графического интерфейса;</w:t>
+        <w:t>Реализация графического интерфейса (Д.А. Мигрин);</w:t>
       </w:r>
     </w:p>
     <w:p>
@@ -2832,7 +2832,7 @@
       </w:pPr>
       <w:r>
         <w:rPr/>
-        <w:t>Создание программы на языке программирования C++;</w:t>
+        <w:t>Создание программы на языке программирования C++ (В.А. Будкин);</w:t>
       </w:r>
     </w:p>
     <w:p>
@@ -2846,7 +2846,7 @@
       </w:pPr>
       <w:r>
         <w:rPr/>
-        <w:t>Визуализация решения задачи;</w:t>
+        <w:t>Визуализация решения задачи (А.И. Бегеза);</w:t>
       </w:r>
     </w:p>
     <w:p>
@@ -2860,7 +2860,7 @@
       </w:pPr>
       <w:r>
         <w:rPr/>
-        <w:t>Связь программы и графического интерфейса;</w:t>
+        <w:t>Связь программы и графического интерфейса (А.И. Бегеза);</w:t>
       </w:r>
     </w:p>
     <w:p>
@@ -2874,7 +2874,7 @@
       </w:pPr>
       <w:r>
         <w:rPr/>
-        <w:t>Тестирование финальной версии программы;</w:t>
+        <w:t>Тестирование финальной версии программы (Все члены бригады);</w:t>
       </w:r>
     </w:p>
     <w:p>
@@ -2888,7 +2888,7 @@
       </w:pPr>
       <w:r>
         <w:rPr/>
-        <w:t>Демонстрация финальной версии программы и отчета.</w:t>
+        <w:t>Демонстрация финальной версии программы и отчета (Все члены бригады).</w:t>
       </w:r>
     </w:p>
     <w:p>
@@ -3052,7 +3052,23 @@
       </w:pPr>
       <w:r>
         <w:rPr/>
-        <w:t>Для достижения поставленной цели были изучены принципы работы генетических алгоритмов с использованием учебных пособий [2] и [3]</w:t>
+        <w:t>Для достижения поставленной цели были изучены принципы работы генетических алгоритмов с использованием учебных пособий [</w:t>
+      </w:r>
+      <w:r>
+        <w:rPr/>
+        <w:t>1</w:t>
+      </w:r>
+      <w:r>
+        <w:rPr/>
+        <w:t xml:space="preserve">] и </w:t>
+      </w:r>
+      <w:r>
+        <w:rPr/>
+        <w:t>[2</w:t>
+      </w:r>
+      <w:r>
+        <w:rPr/>
+        <w:t>]</w:t>
       </w:r>
     </w:p>
     <w:p>
@@ -5172,7 +5188,15 @@
       </w:pPr>
       <w:r>
         <w:rPr/>
-        <w:t>Разработанный программный код размещён в удалённом репозитории [1].</w:t>
+        <w:t>Разработанный программный код размещён в удалённом репозитории [</w:t>
+      </w:r>
+      <w:r>
+        <w:rPr/>
+        <w:t>3</w:t>
+      </w:r>
+      <w:r>
+        <w:rPr/>
+        <w:t>].</w:t>
       </w:r>
       <w:r>
         <w:br w:type="page"/>
@@ -5216,7 +5240,7 @@
       </w:pPr>
       <w:r>
         <w:rPr/>
-        <w:t>Репозиторий с кодом программы [Электронный ресурс]. URL: https://github.com/BudkinVadim/SummerPracticePro (дата обращения: 16.07.2026).</w:t>
+        <w:t>Вирсански Э. Генетические алгоритмы на Python / пер. с англ. А. А. Слинкина. — М.: ДМК Пресс, 2020. — 286 с.</w:t>
       </w:r>
     </w:p>
     <w:p>
@@ -5231,7 +5255,7 @@
       </w:pPr>
       <w:r>
         <w:rPr/>
-        <w:t>Вирсански Э. Генетические алгоритмы на Python / пер. с англ. А. А. Слинкина. — М.: ДМК Пресс, 2020. — 286 с.</w:t>
+        <w:t>Панченко Т. В. Генетические алгоритмы: учебно-методическое пособие / под ред. Ю. Ю. Тарасевича. — Астрахань: Издательский дом «Астраханский университет», 2007. — 87 с.</w:t>
       </w:r>
     </w:p>
     <w:p>
@@ -5246,7 +5270,7 @@
       </w:pPr>
       <w:r>
         <w:rPr/>
-        <w:t>Панченко Т. В. Генетические алгоритмы: учебно-методическое пособие / под ред. Ю. Ю. Тарасевича. — Астрахань: Издательский дом «Астраханский университет», 2007. — 87 с.</w:t>
+        <w:t>Репозиторий с кодом программы [Электронный ресурс]. URL: https://github.com/BudkinVadim/SummerPracticePro (дата обращения: 16.07.2026).</w:t>
       </w:r>
     </w:p>
     <w:p>
@@ -5338,7 +5362,7 @@
       <w:rPr>
         <w:rStyle w:val="PageNumber"/>
       </w:rPr>
-      <w:t>26</w:t>
+      <w:t>27</w:t>
     </w:r>
     <w:r>
       <w:rPr>
@@ -6815,7 +6839,7 @@
       <w:jc w:val="both"/>
     </w:pPr>
     <w:rPr>
-      <w:rFonts w:ascii="Times New Roman" w:hAnsi="Times New Roman" w:cs="Times New Roman" w:eastAsia="Noto Serif CJK SC"/>
+      <w:rFonts w:ascii="Times New Roman" w:hAnsi="Times New Roman" w:eastAsia="Noto Serif CJK SC" w:cs="Times New Roman"/>
       <w:color w:val="auto"/>
       <w:kern w:val="0"/>
       <w:sz w:val="28"/>

</xml_diff>